<commit_message>
Update T27 aero lap sim workflow
</commit_message>
<xml_diff>
--- a/Lap Sim March 2026/T27_LapSim_Aero_Target_Engineering_Report.docx
+++ b/Lap Sim March 2026/T27_LapSim_Aero_Target_Engineering_Report.docx
@@ -263,7 +263,7 @@
           <w:sz w:val="24"/>
           <w:sz-cs w:val="24"/>
         </w:rPr>
-        <w:t xml:space="preserve">The updated engineering recommendation is to use the lap sim with feasibility caps based on expected CUFSAE aero capability. At about 15 m/s, which is approximately 35 mph, a reasonable expected total downforce range is 90 to 135 lbf, with drag slightly below half the downforce. The previous year's aero efficiency was about L/D = 2.2.</w:t>
+        <w:t xml:space="preserve">The updated engineering recommendation is to use the lap sim with feasibility caps based on expected CUFSAE aero capability. At about 15 m/s, which is approximately 35 mph, a reasonable expected total downforce range is 90 to 135 lbf, which is approximately 400 to 600 N. Drag should be slightly below half of downforce, roughly 40 to 65 lbf at that speed. The previous year's aero efficiency was about L/D = 2.2, so the sweep should not be allowed to select much higher efficiency unless there is CFD or test evidence to support it. The MATLAB runner now enforces downforce, drag, and L/D as separate feasibility gates so the best feasible result cannot pass only by exploiting one metric.</w:t>
       </w:r>
     </w:p>
     <w:p>
@@ -362,7 +362,18 @@
           <w:sz w:val="24"/>
           <w:sz-cs w:val="24"/>
         </w:rPr>
-        <w:t xml:space="preserve">| Max lift-to-drag ratio | 2.5 | Allows some improvement over the previous L/D around 2.2, but rejects unrealistic values such as L/D 16. |</w:t>
+        <w:t xml:space="preserve">| Total drag target at reference speed | 40 to 65 lbf | Keeps drag near the expected slightly-below-half-of-downforce range and blocks unrealistically low-drag aero. |</w:t>
+      </w:r>
+    </w:p>
+    <w:p>
+      <w:pPr/>
+      <w:r>
+        <w:rPr>
+          <w:rFonts w:ascii="Helvetica Light" w:hAnsi="Helvetica Light" w:cs="Helvetica Light"/>
+          <w:sz w:val="24"/>
+          <w:sz-cs w:val="24"/>
+        </w:rPr>
+        <w:t xml:space="preserve">| Lift-to-drag target window | 2.0 to 2.4 | Centers the feasible sweep around last year's L/D about 2.2 and rejects unrealistic values such as L/D 16. |</w:t>
       </w:r>
     </w:p>
     <w:p>
@@ -439,7 +450,7 @@
           <w:sz w:val="24"/>
           <w:sz-cs w:val="24"/>
         </w:rPr>
-        <w:t xml:space="preserve">| Lap-sim `CD_target` | about `0.020` | Gives about 53 lbf drag at 35 mph and L/D near 2.25. |</w:t>
+        <w:t xml:space="preserve">| Lap-sim `CD_target` | about `0.020` | Gives about 53 lbf drag at 35 mph, slightly below half of downforce, with L/D near 2.25. |</w:t>
       </w:r>
     </w:p>
     <w:p>
@@ -1990,7 +2001,7 @@
           <w:sz w:val="24"/>
           <w:sz-cs w:val="24"/>
         </w:rPr>
-        <w:t xml:space="preserve">| Primary feasible lap-sim L/D | about `2.2` nominal, max feasible cap `2.5` | Based on previous-year efficiency near 2.2. |</w:t>
+        <w:t xml:space="preserve">| Primary feasible lap-sim L/D | about `2.2` nominal, feasible window `2.0` to `2.4` | Based on previous-year efficiency near 2.2; prevents unrealistic efficiency from winning. |</w:t>
       </w:r>
     </w:p>
     <w:p>
@@ -2078,7 +2089,7 @@
           <w:sz w:val="24"/>
           <w:sz-cs w:val="24"/>
         </w:rPr>
-        <w:t xml:space="preserve">- refine the 90-135 lbf downforce window and L/D 2.5 cap with measured CUFSAE data as soon as possible</w:t>
+        <w:t xml:space="preserve">- refine the 90-135 lbf downforce window, 40-65 lbf drag window, and L/D 2.0-2.4 feasibility window with measured CUFSAE data as soon as possible</w:t>
       </w:r>
     </w:p>
     <w:p>
@@ -2287,7 +2298,7 @@
           <w:sz w:val="24"/>
           <w:sz-cs w:val="24"/>
         </w:rPr>
-        <w:t xml:space="preserve">| Feasible nominal target | 0.045 | 0.020 | 0.475 | 119 lbf | 53 lbf | 2.25 | Plausible first target using CUFSAE expected aero capability. |</w:t>
+        <w:t xml:space="preserve">| Feasible nominal target | 0.045 | 0.020 | 0.475 | 119 lbf | 53 lbf | 2.25 | Plausible first target using CUFSAE expected aero capability and last year's efficiency. |</w:t>
       </w:r>
     </w:p>
     <w:p>
@@ -2573,7 +2584,7 @@
           <w:sz w:val="24"/>
           <w:sz-cs w:val="24"/>
         </w:rPr>
-        <w:t xml:space="preserve">Across the expected 90-135 lbf downforce window, the front/rear split at `CoP=0.475` is approximately:</w:t>
+        <w:t xml:space="preserve">Across the expected 90-135 lbf (400-600 N) downforce window, the front/rear split at `CoP=0.475` is approximately:</w:t>
       </w:r>
     </w:p>
     <w:p>
@@ -2628,7 +2639,7 @@
           <w:sz w:val="24"/>
           <w:sz-cs w:val="24"/>
         </w:rPr>
-        <w:t xml:space="preserve">Total drag target range = about 40 to 65 lbf at 35 mph</w:t>
+        <w:t xml:space="preserve">Total drag target range = about 40 to 65 lbf at 35 mph, slightly below half of downforce</w:t>
       </w:r>
     </w:p>
     <w:p>
@@ -5092,7 +5103,7 @@
           <w:sz w:val="24"/>
           <w:sz-cs w:val="24"/>
         </w:rPr>
-        <w:t xml:space="preserve">| Unconstrained aero target is physically impossible | Unrealistic CL/CD recommendation | Use feasibility caps for max downforce and max L/D before selecting design goals. |</w:t>
+        <w:t xml:space="preserve">| Unconstrained aero target is physically impossible | Unrealistic CL/CD recommendation | Use feasibility limits for downforce, drag, and L/D before selecting design goals. |</w:t>
       </w:r>
     </w:p>
     <w:p>
@@ -5213,7 +5224,7 @@
           <w:sz w:val="24"/>
           <w:sz-cs w:val="24"/>
         </w:rPr>
-        <w:t xml:space="preserve">2. Refine the 90-135 lbf downforce window and L/D 2.5 feasibility cap with measured or CFD-backed values.</w:t>
+        <w:t xml:space="preserve">2. Refine the 90-135 lbf downforce window, 40-65 lbf drag window, and L/D 2.0-2.4 feasibility window with measured or CFD-backed values.</w:t>
       </w:r>
     </w:p>
     <w:p>
@@ -5246,7 +5257,7 @@
           <w:sz w:val="24"/>
           <w:sz-cs w:val="24"/>
         </w:rPr>
-        <w:t xml:space="preserve">   - `CD = 0.015` to `0.040`</w:t>
+        <w:t xml:space="preserve">   - `CD = 0.015` to `0.030`, filtered to keep 35 mph drag near 40-65 lbf and L/D near 2.2</w:t>
       </w:r>
     </w:p>
     <w:p>
@@ -5565,7 +5576,7 @@
           <w:sz w:val="24"/>
           <w:sz-cs w:val="24"/>
         </w:rPr>
-        <w:t xml:space="preserve">With the current CUFSAE-based feasibility caps, the defensible nominal starting target is about CL=0.045, CD=0.020, and CoP near 47.5 percent front, while preserving adjustability from roughly 45 percent to 52.5 percent front for validation.</w:t>
+        <w:t xml:space="preserve">With the current CUFSAE-based feasibility limits, the defensible nominal starting target is about CL=0.045, CD=0.020, and CoP near 47.5 percent front, while preserving adjustability from roughly 45 percent to 52.5 percent front for validation. This keeps the target near 119 lbf downforce, 53 lbf drag, and L/D about 2.25 at 35 mph.</w:t>
       </w:r>
     </w:p>
     <w:p>
@@ -5829,18 +5840,18 @@
           <w:sz w:val="24"/>
           <w:sz-cs w:val="24"/>
         </w:rPr>
-        <w:t xml:space="preserve">| Recommended feasible nominal target | 0.045 | 0.020 | 0.475 | About 119 lbf and L/D 2.25 at 35 mph. |</w:t>
-      </w:r>
-    </w:p>
-    <w:p>
-      <w:pPr/>
-      <w:r>
-        <w:rPr>
-          <w:rFonts w:ascii="Helvetica Light" w:hAnsi="Helvetica Light" w:cs="Helvetica Light"/>
-          <w:sz w:val="24"/>
-          <w:sz-cs w:val="24"/>
-        </w:rPr>
-        <w:t xml:space="preserve">| Feasible sweep range | 0.034 to 0.051 | 0.016 to 0.023 | 0.450 to 0.525 | Based on 90-135 lbf downforce and L/D around 2.2 at 35 mph. |</w:t>
+        <w:t xml:space="preserve">| Recommended feasible nominal target | 0.045 | 0.020 | 0.475 | About 119 lbf downforce, 53 lbf drag, and L/D 2.25 at 35 mph. |</w:t>
+      </w:r>
+    </w:p>
+    <w:p>
+      <w:pPr/>
+      <w:r>
+        <w:rPr>
+          <w:rFonts w:ascii="Helvetica Light" w:hAnsi="Helvetica Light" w:cs="Helvetica Light"/>
+          <w:sz w:val="24"/>
+          <w:sz-cs w:val="24"/>
+        </w:rPr>
+        <w:t xml:space="preserve">| Feasible sweep range | 0.034 to 0.051 | about 0.015 to 0.025, filtered by drag and L/D | 0.450 to 0.525 | Based on 90-135 lbf downforce, 40-65 lbf drag, and L/D around 2.2 at 35 mph. |</w:t>
       </w:r>
     </w:p>
     <w:p>
@@ -5884,7 +5895,7 @@
           <w:sz w:val="24"/>
           <w:sz-cs w:val="24"/>
         </w:rPr>
-        <w:t xml:space="preserve">This lap sim gives us an engineering reason for aero targets instead of copying previous-year values, but it also shows why feasibility limits matter. The unconstrained model wants CL and CD values that produce about 422 lbf at 35 mph with L/D near 16, which is not realistic for our current car. After applying CUFSAE-based feasibility caps, a more defensible starting point is about CL=0.045, CD=0.020, and CoP around 47.5 percent front. The exact caps should be replaced with measured or CFD-backed CUFSAE values, then validated with speed, acceleration, lateral g, gear, and distance data from the real car.</w:t>
+        <w:t xml:space="preserve">This lap sim gives us an engineering reason for aero targets instead of copying previous-year values, but it also shows why feasibility limits matter. The unconstrained model wants CL and CD values that produce about 422 lbf at 35 mph with L/D near 16, which is not realistic for our current car. After applying CUFSAE-based feasibility limits, a more defensible starting point is about CL=0.045, CD=0.020, and CoP around 47.5 percent front. The exact caps should be replaced with measured or CFD-backed CUFSAE values, then validated with speed, acceleration, lateral g, gear, and distance data from the real car.</w:t>
       </w:r>
     </w:p>
     <w:p>

</xml_diff>